<commit_message>
Remove NUS exchange from education section
Co-Authored-By: Claude Sonnet 5.5 <noreply@anthropic.com>
Claude-Session: https://claude.ai/code/session_014JAFaG7KPZW1VubnBkeedU
</commit_message>
<xml_diff>
--- a/Resume_McCombs_20261009.docx
+++ b/Resume_McCombs_20261009.docx
@@ -130,88 +130,6 @@
           <w:szCs w:val="20"/>
         </w:rPr>
         <w:t xml:space="preserve">Aug 2013</w:t>
-      </w:r>
-    </w:p>
-    <w:p>
-      <w:pPr>
-        <w:tabs>
-          <w:tab w:val="right" w:pos="10514"/>
-        </w:tabs>
-        <w:spacing w:after="0" w:before="60"/>
-      </w:pPr>
-      <w:r>
-        <w:rPr>
-          <w:rFonts w:ascii="Calibri" w:cs="Calibri" w:eastAsia="Calibri" w:hAnsi="Calibri"/>
-          <w:b/>
-          <w:bCs/>
-          <w:sz w:val="20"/>
-          <w:szCs w:val="20"/>
-        </w:rPr>
-        <w:t xml:space="preserve">National University of Singapore</w:t>
-      </w:r>
-      <w:r>
-        <w:rPr>
-          <w:rFonts w:ascii="Calibri" w:cs="Calibri" w:eastAsia="Calibri" w:hAnsi="Calibri"/>
-          <w:sz w:val="20"/>
-          <w:szCs w:val="20"/>
-        </w:rPr>
-        <w:t xml:space="preserve"> – Singapore</w:t>
-      </w:r>
-      <w:r>
-        <w:rPr>
-          <w:rFonts w:ascii="Calibri" w:cs="Calibri" w:eastAsia="Calibri" w:hAnsi="Calibri"/>
-          <w:sz w:val="20"/>
-          <w:szCs w:val="20"/>
-        </w:rPr>
-        <w:t xml:space="preserve">	</w:t>
-      </w:r>
-      <w:r>
-        <w:rPr>
-          <w:rFonts w:ascii="Calibri" w:cs="Calibri" w:eastAsia="Calibri" w:hAnsi="Calibri"/>
-          <w:b/>
-          <w:bCs/>
-          <w:sz w:val="20"/>
-          <w:szCs w:val="20"/>
-        </w:rPr>
-        <w:t xml:space="preserve"/>
-      </w:r>
-    </w:p>
-    <w:p>
-      <w:pPr>
-        <w:tabs>
-          <w:tab w:val="right" w:pos="10514"/>
-        </w:tabs>
-        <w:spacing w:after="0" w:before="0"/>
-      </w:pPr>
-      <w:r>
-        <w:rPr>
-          <w:rFonts w:ascii="Calibri" w:cs="Calibri" w:eastAsia="Calibri" w:hAnsi="Calibri"/>
-          <w:b/>
-          <w:bCs/>
-          <w:i/>
-          <w:iCs/>
-          <w:sz w:val="20"/>
-          <w:szCs w:val="20"/>
-        </w:rPr>
-        <w:t xml:space="preserve">Study Abroad</w:t>
-      </w:r>
-      <w:r>
-        <w:rPr>
-          <w:rFonts w:ascii="Calibri" w:cs="Calibri" w:eastAsia="Calibri" w:hAnsi="Calibri"/>
-          <w:sz w:val="20"/>
-          <w:szCs w:val="20"/>
-        </w:rPr>
-        <w:t xml:space="preserve">	</w:t>
-      </w:r>
-      <w:r>
-        <w:rPr>
-          <w:rFonts w:ascii="Calibri" w:cs="Calibri" w:eastAsia="Calibri" w:hAnsi="Calibri"/>
-          <w:b/>
-          <w:bCs/>
-          <w:sz w:val="20"/>
-          <w:szCs w:val="20"/>
-        </w:rPr>
-        <w:t xml:space="preserve">Aug – Dec 2012</w:t>
       </w:r>
     </w:p>
     <w:p>

</xml_diff>